<commit_message>
end on to day
</commit_message>
<xml_diff>
--- a/Report Bug.docx
+++ b/Report Bug.docx
@@ -4,35 +4,6 @@
   <w:body>
     <w:p>
       <w:r>
-        <w:t xml:space="preserve">Сделай развернутый просмотр страницы </w:t>
-      </w:r>
-      <w:r>
-        <w:rPr>
-          <w:lang w:val="en-US"/>
-        </w:rPr>
-        <w:t>Clients</w:t>
-      </w:r>
-      <w:r>
-        <w:t xml:space="preserve"> </w:t>
-      </w:r>
-      <w:r>
-        <w:t>для каждого клиента</w:t>
-      </w:r>
-    </w:p>
-    <w:p>
-      <w:r>
-        <w:t>Н</w:t>
-      </w:r>
-      <w:r>
-        <w:t>е работает смена пароля</w:t>
-      </w:r>
-      <w:r>
-        <w:t>.</w:t>
-      </w:r>
-      <w:r>
-        <w:t xml:space="preserve"> </w:t>
-      </w:r>
-      <w:r>
         <w:t>А</w:t>
       </w:r>
       <w:r>
@@ -42,28 +13,7 @@
         <w:t>. Уведомления не показываются пока не нажмешь кнопку «Отметить все как прочитанное».</w:t>
       </w:r>
       <w:r>
-        <w:t xml:space="preserve"> Активность, Вся история появляется только после того как нажимаешь на фильтр, значит статична, должна быть динамична. </w:t>
-      </w:r>
-      <w:r>
-        <w:t>Сделать рабочую кнопку «</w:t>
-      </w:r>
-      <w:r>
-        <w:rPr>
-          <w:lang w:val="en-US"/>
-        </w:rPr>
-        <w:t>Telegram</w:t>
-      </w:r>
-      <w:r>
-        <w:t xml:space="preserve"> </w:t>
-      </w:r>
-      <w:r>
-        <w:rPr>
-          <w:lang w:val="en-US"/>
-        </w:rPr>
-        <w:t>Bot</w:t>
-      </w:r>
-      <w:r>
-        <w:t>»</w:t>
+        <w:t xml:space="preserve"> Активность, Вся история появляется только после того как нажимаешь на фильтр, значит статична, должна быть динамична</w:t>
       </w:r>
     </w:p>
     <w:p>
@@ -78,67 +28,151 @@
         </w:rPr>
       </w:pPr>
       <w:r>
-        <w:t xml:space="preserve">На основе анализа содержания выявлены следующие недостатки работы, которые требуют доработки для повышения качества и готовности к продакшену: нет полноценного тестирования (unit/integration), развертывания (Docker/Heroku), аутентификации / авторизации; фокус на SQLite без продакшн-БД; отсутствие метрик производительности. </w:t>
-      </w:r>
-      <w:bookmarkStart w:id="0" w:name="рекомендация_1_внедрить_полноценн_acc242"/>
+        <w:t>нет полноценного тестирования (</w:t>
+      </w:r>
+      <w:proofErr w:type="spellStart"/>
+      <w:r>
+        <w:t>unit</w:t>
+      </w:r>
+      <w:proofErr w:type="spellEnd"/>
+      <w:r>
+        <w:t>/</w:t>
+      </w:r>
+      <w:proofErr w:type="spellStart"/>
+      <w:r>
+        <w:t>integration</w:t>
+      </w:r>
+      <w:proofErr w:type="spellEnd"/>
+      <w:r>
+        <w:t>), развертывания (</w:t>
+      </w:r>
+      <w:proofErr w:type="spellStart"/>
+      <w:r>
+        <w:t>Docker</w:t>
+      </w:r>
+      <w:proofErr w:type="spellEnd"/>
+      <w:r>
+        <w:t>/</w:t>
+      </w:r>
+      <w:proofErr w:type="spellStart"/>
+      <w:r>
+        <w:t>Heroku</w:t>
+      </w:r>
+      <w:proofErr w:type="spellEnd"/>
+      <w:r>
+        <w:t xml:space="preserve">), аутентификации / авторизации; фокус на </w:t>
+      </w:r>
+      <w:proofErr w:type="spellStart"/>
+      <w:r>
+        <w:t>SQLite</w:t>
+      </w:r>
+      <w:proofErr w:type="spellEnd"/>
+      <w:r>
+        <w:t xml:space="preserve"> без продакшн-БД; отсутствие метрик производительности. </w:t>
+      </w:r>
+      <w:bookmarkStart w:id="0" w:name="рекомендация_3_поддержать_продакш_c9edda"/>
     </w:p>
     <w:p>
-      <w:r>
-        <w:t>1. Для полноценного тестировани</w:t>
-      </w:r>
+      <w:bookmarkStart w:id="1" w:name="рекомендация_4_добавить_метрики_и_831620"/>
       <w:bookmarkEnd w:id="0"/>
       <w:r>
-        <w:t xml:space="preserve">я добавь unit-тесты для CRUD-операций (pytest для FastAPI эндпоинтов, тесты моделей SQLAlchemy) и интеграционные тесты (API с реальными запросами). Разработай тестовые сценарии для edge-кейсов (пустая БД, неверные данные). </w:t>
-      </w:r>
-      <w:bookmarkStart w:id="1" w:name="рекомендация_2_реализовать_аутент_e95bd9"/>
+        <w:t>4. Добавь метрики и мониторинг</w:t>
+      </w:r>
+      <w:bookmarkEnd w:id="1"/>
+      <w:r>
+        <w:t xml:space="preserve">. Внедри </w:t>
+      </w:r>
+      <w:proofErr w:type="spellStart"/>
+      <w:r>
+        <w:t>Prometheus</w:t>
+      </w:r>
+      <w:proofErr w:type="spellEnd"/>
+      <w:r>
+        <w:t xml:space="preserve"> для метрик API (</w:t>
+      </w:r>
+      <w:proofErr w:type="spellStart"/>
+      <w:r>
+        <w:t>response</w:t>
+      </w:r>
+      <w:proofErr w:type="spellEnd"/>
+      <w:r>
+        <w:t xml:space="preserve"> </w:t>
+      </w:r>
+      <w:proofErr w:type="spellStart"/>
+      <w:r>
+        <w:t>time</w:t>
+      </w:r>
+      <w:proofErr w:type="spellEnd"/>
+      <w:r>
+        <w:t xml:space="preserve">, </w:t>
+      </w:r>
+      <w:proofErr w:type="spellStart"/>
+      <w:r>
+        <w:t>errors</w:t>
+      </w:r>
+      <w:proofErr w:type="spellEnd"/>
+      <w:r>
+        <w:t>), логирование (</w:t>
+      </w:r>
+      <w:proofErr w:type="spellStart"/>
+      <w:r>
+        <w:t>structlog</w:t>
+      </w:r>
+      <w:proofErr w:type="spellEnd"/>
+      <w:r>
+        <w:t>), сбор статистики (</w:t>
+      </w:r>
+      <w:proofErr w:type="spellStart"/>
+      <w:r>
+        <w:t>SQLAlchemy</w:t>
+      </w:r>
+      <w:proofErr w:type="spellEnd"/>
+      <w:r>
+        <w:t xml:space="preserve"> </w:t>
+      </w:r>
+      <w:proofErr w:type="spellStart"/>
+      <w:r>
+        <w:t>events</w:t>
+      </w:r>
+      <w:proofErr w:type="spellEnd"/>
+      <w:r>
+        <w:t>). Проанализируй производительность (</w:t>
+      </w:r>
+      <w:proofErr w:type="spellStart"/>
+      <w:r>
+        <w:t>load</w:t>
+      </w:r>
+      <w:proofErr w:type="spellEnd"/>
+      <w:r>
+        <w:t xml:space="preserve"> </w:t>
+      </w:r>
+      <w:proofErr w:type="spellStart"/>
+      <w:r>
+        <w:t>testing</w:t>
+      </w:r>
+      <w:proofErr w:type="spellEnd"/>
+      <w:r>
+        <w:t xml:space="preserve"> с </w:t>
+      </w:r>
+      <w:proofErr w:type="spellStart"/>
+      <w:r>
+        <w:t>locust</w:t>
+      </w:r>
+      <w:proofErr w:type="spellEnd"/>
+      <w:r>
+        <w:t xml:space="preserve">). </w:t>
+      </w:r>
+      <w:bookmarkStart w:id="2" w:name="fnref1_4"/>
+      <w:bookmarkStart w:id="3" w:name="рекомендация_5_улучшить_документа_2cc4a6"/>
+      <w:bookmarkEnd w:id="2"/>
     </w:p>
+    <w:bookmarkEnd w:id="3"/>
     <w:p>
       <w:r>
-        <w:t>2. Для реализации аутентификацию и авторизаци</w:t>
-      </w:r>
-      <w:bookmarkEnd w:id="1"/>
-      <w:r>
-        <w:t>и можно интегрировать JWT (fastapi-users или OAuth2) для защиты API, роли (admin/user). Добавь middleware для CORS с origin-листингом. Это устранит уязвимости.</w:t>
-      </w:r>
-      <w:bookmarkStart w:id="2" w:name="fnref1_2"/>
-      <w:bookmarkEnd w:id="2"/>
-      <w:r>
-        <w:t xml:space="preserve"> </w:t>
-      </w:r>
-      <w:bookmarkStart w:id="3" w:name="рекомендация_3_поддержать_продакш_c9edda"/>
-    </w:p>
-    <w:p>
-      <w:r>
-        <w:t xml:space="preserve">3. Для поддержки продакшн-БД </w:t>
-      </w:r>
-      <w:bookmarkEnd w:id="3"/>
-      <w:r>
-        <w:t xml:space="preserve">сменить (миграцией) SQLite на PostgreSQL/MySQL (Alembic для миграций), добавь Docker-compose для контейнеризации (backend + DB). Разверни на Heroku/Vercel с CI/CD (GitHub Actions). </w:t>
-      </w:r>
-      <w:bookmarkStart w:id="4" w:name="рекомендация_4_добавить_метрики_и_831620"/>
-    </w:p>
-    <w:p>
-      <w:r>
-        <w:t>4. Добавь метрики и мониторинг</w:t>
-      </w:r>
+        <w:t xml:space="preserve">Оформите отчет о тестировании / производительности. </w:t>
+      </w:r>
+      <w:bookmarkStart w:id="4" w:name="fnref1_5"/>
       <w:bookmarkEnd w:id="4"/>
-      <w:r>
-        <w:t xml:space="preserve">. Внедри Prometheus для метрик API (response time, errors), логирование (structlog), сбор статистики (SQLAlchemy events). Проанализируй производительность (load testing с locust). </w:t>
-      </w:r>
-      <w:bookmarkStart w:id="5" w:name="fnref1_4"/>
-      <w:bookmarkStart w:id="6" w:name="рекомендация_5_улучшить_документа_2cc4a6"/>
-      <w:bookmarkEnd w:id="5"/>
-    </w:p>
-    <w:p>
-      <w:r>
-        <w:t>5. Для улучшения документации и ревью</w:t>
-      </w:r>
-      <w:bookmarkEnd w:id="6"/>
-      <w:r>
-        <w:t xml:space="preserve"> создай README с инструкциями установки/запуска, Swagger/OpenAPI docs. Проведи code review (black/flake8, mypy), добавьте docstrings. Оформите отчет о тестировании / производительности. </w:t>
-      </w:r>
-      <w:bookmarkStart w:id="7" w:name="fnref1_5"/>
-      <w:bookmarkEnd w:id="7"/>
       <w:r>
         <w:t xml:space="preserve">Надо дописать </w:t>
       </w:r>
@@ -148,17 +182,9 @@
         </w:rPr>
         <w:t>README</w:t>
       </w:r>
-      <w:bookmarkStart w:id="8" w:name="рекомендация_6_расширить_функционал"/>
+      <w:bookmarkStart w:id="5" w:name="рекомендация_6_расширить_функционал"/>
     </w:p>
-    <w:p>
-      <w:r>
-        <w:t>6. Можно также расширить функционал</w:t>
-      </w:r>
-      <w:bookmarkEnd w:id="8"/>
-      <w:r>
-        <w:t xml:space="preserve">. Например, добавь уведомления (WebSocket / SMS via Twilio), поиск/экспорт (CSV/PDF), дашборд с аналитикой (заказы по статусу / мастерам). </w:t>
-      </w:r>
-    </w:p>
+    <w:bookmarkEnd w:id="5"/>
     <w:p>
       <w:r>
         <w:t xml:space="preserve">Сделать </w:t>
@@ -176,7 +202,6 @@
         <w:t>самой первой страницей</w:t>
       </w:r>
     </w:p>
-    <w:p/>
     <w:p>
       <w:r>
         <w:t xml:space="preserve">На странице </w:t>
@@ -185,59 +210,7 @@
         <w:rPr>
           <w:lang w:val="en-US"/>
         </w:rPr>
-        <w:t>Profile</w:t>
-      </w:r>
-      <w:r>
-        <w:br/>
-        <w:t>Ошибка загрузки профиля: TypeError: Cannot set properties of null (setting 'value')</w:t>
-      </w:r>
-    </w:p>
-    <w:p>
-      <w:pPr>
-        <w:rPr>
-          <w:lang w:val="en-US"/>
-        </w:rPr>
-      </w:pPr>
-      <w:r>
-        <w:lastRenderedPageBreak/>
-        <w:t xml:space="preserve">    </w:t>
-      </w:r>
-      <w:r>
-        <w:rPr>
-          <w:lang w:val="en-US"/>
-        </w:rPr>
-        <w:t>at loadUserData (profile.html:851:62)</w:t>
-      </w:r>
-    </w:p>
-    <w:p>
-      <w:pPr>
-        <w:rPr>
-          <w:lang w:val="en-US"/>
-        </w:rPr>
-      </w:pPr>
-      <w:r>
-        <w:rPr>
-          <w:lang w:val="en-US"/>
-        </w:rPr>
-        <w:t xml:space="preserve">    at async HTMLDocument.&lt;anonymous&gt; (profile.html:805:17)</w:t>
-      </w:r>
-    </w:p>
-    <w:p>
-      <w:pPr>
-        <w:rPr>
-          <w:lang w:val="en-US"/>
-        </w:rPr>
-      </w:pPr>
-    </w:p>
-    <w:p>
-      <w:r>
-        <w:t xml:space="preserve">Ошибка при нажатие на кнопку + Новая заявка на странице </w:t>
-      </w:r>
-      <w:r>
-        <w:rPr>
-          <w:lang w:val="en-US"/>
-        </w:rPr>
-        <w:t>index</w:t>
+        <w:t>devices</w:t>
       </w:r>
       <w:r>
         <w:t>.</w:t>
@@ -252,16 +225,7 @@
         <w:t xml:space="preserve"> </w:t>
       </w:r>
       <w:r>
-        <w:t xml:space="preserve">и перенаправление на страницу </w:t>
-      </w:r>
-      <w:r>
-        <w:t>orders.html?openNewOrder=true</w:t>
-      </w:r>
-      <w:r>
-        <w:t xml:space="preserve"> </w:t>
-      </w:r>
-      <w:r>
-        <w:t xml:space="preserve">и впринципе висит при заходе на страницу </w:t>
+        <w:t xml:space="preserve">не обновляются данные статуса в соответствие с настоящим статусом на странице </w:t>
       </w:r>
       <w:r>
         <w:rPr>
@@ -278,75 +242,16 @@
         </w:rPr>
         <w:t>html</w:t>
       </w:r>
+      <w:r>
+        <w:t>. Также стоит добавить кнопку сброса фильтро</w:t>
+      </w:r>
+      <w:r>
+        <w:t>в</w:t>
+      </w:r>
     </w:p>
     <w:p>
-      <w:pPr>
-        <w:rPr>
-          <w:lang w:val="en-US"/>
-        </w:rPr>
-      </w:pPr>
-      <w:r>
-        <w:rPr>
-          <w:lang w:val="en-US"/>
-        </w:rPr>
-        <w:t>Uncaught SyntaxError: Unexpected token 'export' (at VM1677 utils.js:2:1)</w:t>
-      </w:r>
-    </w:p>
-    <w:p>
-      <w:pPr>
-        <w:rPr>
-          <w:lang w:val="en-US"/>
-        </w:rPr>
-      </w:pPr>
-    </w:p>
-    <w:p>
-      <w:r>
-        <w:t xml:space="preserve">На странице </w:t>
-      </w:r>
-      <w:r>
-        <w:rPr>
-          <w:lang w:val="en-US"/>
-        </w:rPr>
-        <w:t>devices</w:t>
-      </w:r>
-      <w:r>
-        <w:t>.</w:t>
-      </w:r>
-      <w:r>
-        <w:rPr>
-          <w:lang w:val="en-US"/>
-        </w:rPr>
-        <w:t>html</w:t>
-      </w:r>
-      <w:r>
-        <w:t xml:space="preserve"> </w:t>
-      </w:r>
-      <w:r>
-        <w:t xml:space="preserve">не обновляются данные статуса в соответствие с настоящим статусом на странице </w:t>
-      </w:r>
-      <w:r>
-        <w:rPr>
-          <w:lang w:val="en-US"/>
-        </w:rPr>
-        <w:t>orders</w:t>
-      </w:r>
-      <w:r>
-        <w:t>.</w:t>
-      </w:r>
-      <w:r>
-        <w:rPr>
-          <w:lang w:val="en-US"/>
-        </w:rPr>
-        <w:t>html</w:t>
-      </w:r>
-      <w:r>
-        <w:t>. Также стоит добавить кнопку сброса фильтров</w:t>
-      </w:r>
-    </w:p>
-    <w:p/>
-    <w:p>
-      <w:r>
-        <w:t>Перекидывает с начальной на не ту новую заявку на ремонт</w:t>
+      <w:r>
+        <w:t>Перебрать текст ВКР</w:t>
       </w:r>
     </w:p>
     <w:sectPr>

</xml_diff>